<commit_message>
Strategic Objectives and Literature Review
outlining the the goal of the assignment and discussing the way I will use machine learning to help complete the project using recall
</commit_message>
<xml_diff>
--- a/Capstone Project 2026.docx
+++ b/Capstone Project 2026.docx
@@ -322,6 +322,150 @@
           <w:bCs/>
         </w:rPr>
       </w:pPr>
+      <w:r>
+        <w:rPr>
+          <w:rFonts w:ascii="Times New Roman" w:hAnsi="Times New Roman" w:cs="Times New Roman"/>
+          <w:b/>
+          <w:bCs/>
+        </w:rPr>
+        <w:lastRenderedPageBreak/>
+        <w:t>The Strategic Analytics Objective</w:t>
+      </w:r>
+    </w:p>
+    <w:p>
+      <w:pPr>
+        <w:rPr>
+          <w:rFonts w:ascii="Times New Roman" w:hAnsi="Times New Roman" w:cs="Times New Roman"/>
+        </w:rPr>
+      </w:pPr>
+      <w:r>
+        <w:rPr>
+          <w:rFonts w:ascii="Times New Roman" w:hAnsi="Times New Roman" w:cs="Times New Roman"/>
+        </w:rPr>
+        <w:t>The strategic goal of the project is to shift the diagnosis timeline from a reactive, multi-year loop to an automated, predictive primary care screening mechanism. By tracking early clusters of symptoms, this machine learning engine will calculate an objective risk probability score. This score enables healthcare management teams to stratify the patient population. High-risk cohorts can bypass standard administrative “wait and see” protocols and move straight to specialized pelvic ultrasounds, MRIs or gynaecological care. The business success metric focuses on flattening the time-to-diagnose curve, freeing up clinical capacity, and maximizing organizational efficiency</w:t>
+      </w:r>
+      <w:r>
+        <w:rPr>
+          <w:rFonts w:ascii="Times New Roman" w:hAnsi="Times New Roman" w:cs="Times New Roman"/>
+        </w:rPr>
+        <w:t>.</w:t>
+      </w:r>
+    </w:p>
+    <w:p>
+      <w:pPr>
+        <w:rPr>
+          <w:rFonts w:ascii="Times New Roman" w:hAnsi="Times New Roman" w:cs="Times New Roman"/>
+          <w:b/>
+          <w:bCs/>
+        </w:rPr>
+      </w:pPr>
+      <w:r>
+        <w:rPr>
+          <w:rFonts w:ascii="Times New Roman" w:hAnsi="Times New Roman" w:cs="Times New Roman"/>
+          <w:b/>
+          <w:bCs/>
+        </w:rPr>
+        <w:t>Literature Review</w:t>
+      </w:r>
+    </w:p>
+    <w:p>
+      <w:pPr>
+        <w:rPr>
+          <w:rFonts w:ascii="Times New Roman" w:hAnsi="Times New Roman" w:cs="Times New Roman"/>
+          <w:bCs/>
+        </w:rPr>
+      </w:pPr>
+      <w:r>
+        <w:rPr>
+          <w:rFonts w:ascii="Times New Roman" w:hAnsi="Times New Roman" w:cs="Times New Roman"/>
+          <w:bCs/>
+        </w:rPr>
+        <w:t>Historically, the definitive gold standard for diagnosing endometriosis has been invasive laparoscopic surgery. Consequently, traditional clinical research has overlooked the potential of non-invasive, data-driven screening methods. Recent studies demonstrate that machine learning models can identify subtle, multi-year patterns across electronic health records that human clinicians might miss in a standard 15-minute consultation.</w:t>
+      </w:r>
+    </w:p>
+    <w:p>
+      <w:pPr>
+        <w:rPr>
+          <w:rFonts w:ascii="Times New Roman" w:hAnsi="Times New Roman" w:cs="Times New Roman"/>
+          <w:bCs/>
+        </w:rPr>
+      </w:pPr>
+      <w:r>
+        <w:rPr>
+          <w:rFonts w:ascii="Times New Roman" w:hAnsi="Times New Roman" w:cs="Times New Roman"/>
+          <w:bCs/>
+        </w:rPr>
+        <w:t>When modelling sparse, highly variable conditions like endometriosis, general machine learning metrics require careful alignment with clinical realities. Traditional classification projects maximise Accuracy or Precision (avoiding false positives). In this clinical framework, the overarching strategic priority is Recall (Sensitivity).</w:t>
+      </w:r>
+    </w:p>
+    <w:p>
+      <w:pPr>
+        <w:rPr>
+          <w:rFonts w:ascii="Times New Roman" w:hAnsi="Times New Roman" w:cs="Times New Roman"/>
+          <w:bCs/>
+        </w:rPr>
+      </w:pPr>
+    </w:p>
+    <w:p>
+      <w:pPr>
+        <w:jc w:val="both"/>
+        <w:rPr>
+          <w:rFonts w:ascii="Times New Roman" w:hAnsi="Times New Roman" w:cs="Times New Roman"/>
+          <w:bCs/>
+        </w:rPr>
+      </w:pPr>
+      <w:r>
+        <w:rPr>
+          <w:rFonts w:ascii="Times New Roman" w:hAnsi="Times New Roman" w:cs="Times New Roman"/>
+          <w:bCs/>
+          <w:noProof/>
+        </w:rPr>
+        <w:drawing>
+          <wp:inline distT="0" distB="0" distL="0" distR="0" wp14:anchorId="23666FE4" wp14:editId="7DCEF5B8">
+            <wp:extent cx="6454140" cy="3124200"/>
+            <wp:effectExtent l="0" t="0" r="3810" b="0"/>
+            <wp:docPr id="147225641" name="Picture 1"/>
+            <wp:cNvGraphicFramePr>
+              <a:graphicFrameLocks xmlns:a="http://schemas.openxmlformats.org/drawingml/2006/main" noChangeAspect="1"/>
+            </wp:cNvGraphicFramePr>
+            <a:graphic xmlns:a="http://schemas.openxmlformats.org/drawingml/2006/main">
+              <a:graphicData uri="http://schemas.openxmlformats.org/drawingml/2006/picture">
+                <pic:pic xmlns:pic="http://schemas.openxmlformats.org/drawingml/2006/picture">
+                  <pic:nvPicPr>
+                    <pic:cNvPr id="0" name="Picture 2"/>
+                    <pic:cNvPicPr>
+                      <a:picLocks noChangeAspect="1" noChangeArrowheads="1"/>
+                    </pic:cNvPicPr>
+                  </pic:nvPicPr>
+                  <pic:blipFill>
+                    <a:blip r:embed="rId6">
+                      <a:extLst>
+                        <a:ext uri="{28A0092B-C50C-407E-A947-70E740481C1C}">
+                          <a14:useLocalDpi xmlns:a14="http://schemas.microsoft.com/office/drawing/2010/main" val="0"/>
+                        </a:ext>
+                      </a:extLst>
+                    </a:blip>
+                    <a:srcRect/>
+                    <a:stretch>
+                      <a:fillRect/>
+                    </a:stretch>
+                  </pic:blipFill>
+                  <pic:spPr bwMode="auto">
+                    <a:xfrm>
+                      <a:off x="0" y="0"/>
+                      <a:ext cx="6454140" cy="3124200"/>
+                    </a:xfrm>
+                    <a:prstGeom prst="rect">
+                      <a:avLst/>
+                    </a:prstGeom>
+                    <a:noFill/>
+                  </pic:spPr>
+                </pic:pic>
+              </a:graphicData>
+            </a:graphic>
+          </wp:inline>
+        </w:drawing>
+      </w:r>
     </w:p>
     <w:p>
       <w:pPr>
@@ -1671,4 +1815,16 @@
     </a:ext>
   </a:extLst>
 </a:theme>
+</file>
+
+<file path=customXml/item1.xml><?xml version="1.0" encoding="utf-8"?>
+<b:Sources xmlns:b="http://schemas.openxmlformats.org/officeDocument/2006/bibliography" xmlns="http://schemas.openxmlformats.org/officeDocument/2006/bibliography" SelectedStyle="\APASixthEditionOfficeOnline.xsl" StyleName="APA" Version="6"/>
+</file>
+
+<file path=customXml/itemProps1.xml><?xml version="1.0" encoding="utf-8"?>
+<ds:datastoreItem xmlns:ds="http://schemas.openxmlformats.org/officeDocument/2006/customXml" ds:itemID="{BC28B357-95E0-409D-BD43-8DD87A3EB3F4}">
+  <ds:schemaRefs>
+    <ds:schemaRef ds:uri="http://schemas.openxmlformats.org/officeDocument/2006/bibliography"/>
+  </ds:schemaRefs>
+</ds:datastoreItem>
 </file>
</xml_diff>

<commit_message>
Data Understanding and Architecture
Setting up the blueprint  showing how the machine learning model will read the patient info. Discussion of a second dataset as a back up. Next I will create the Architecture Map.
</commit_message>
<xml_diff>
--- a/Capstone Project 2026.docx
+++ b/Capstone Project 2026.docx
@@ -72,7 +72,15 @@
           <w:sz w:val="28"/>
           <w:szCs w:val="28"/>
         </w:rPr>
-        <w:t>Closing the Diagnostic Gap: Leveraging Machine Learning for Early Endometriosis Risk Stratification and Operation Optimization.</w:t>
+        <w:t xml:space="preserve">Closing the Diagnostic Gap: Leveraging Machine Learning for Early Endometriosis </w:t>
+      </w:r>
+      <w:r>
+        <w:rPr>
+          <w:rFonts w:ascii="Times New Roman" w:hAnsi="Times New Roman" w:cs="Times New Roman"/>
+          <w:sz w:val="28"/>
+          <w:szCs w:val="28"/>
+        </w:rPr>
+        <w:t>Detection.</w:t>
       </w:r>
     </w:p>
     <w:p>
@@ -153,7 +161,7 @@
         <w:rPr>
           <w:rFonts w:ascii="Times New Roman" w:hAnsi="Times New Roman" w:cs="Times New Roman"/>
         </w:rPr>
-        <w:t>This capstone project proposes a proactive data analytics pipeline to risk-stratify patients early using Synthetic Mass (Synthea) ecosystem. Extracting and processing the clinical data which include symptomatic logs of chronic pelvic pain, menorrhagia, dysmenorrhea and historical prescriptions, this project will develop a machine learning risk-scoring engine. A tree-based algorithm such as Random Forest</w:t>
+        <w:t>This capstone project proposes a proactive data analytics pipeline to risk-stratify patients. Extracting and processing the clinical data which include symptomatic logs of chronic pelvic pain, menorrhagia, dysmenorrhea and historical prescriptions, this project will develop a machine learning risk-scoring engine. A tree-based algorithm such as Random Forest</w:t>
       </w:r>
       <w:r>
         <w:rPr>
@@ -212,6 +220,14 @@
           <w:b/>
           <w:bCs/>
         </w:rPr>
+        <w:t xml:space="preserve">2.1 </w:t>
+      </w:r>
+      <w:r>
+        <w:rPr>
+          <w:rFonts w:ascii="Times New Roman" w:hAnsi="Times New Roman" w:cs="Times New Roman"/>
+          <w:b/>
+          <w:bCs/>
+        </w:rPr>
         <w:t>The Operational and Clinical Problem</w:t>
       </w:r>
     </w:p>
@@ -329,6 +345,14 @@
           <w:bCs/>
         </w:rPr>
         <w:lastRenderedPageBreak/>
+        <w:t xml:space="preserve">2.2 </w:t>
+      </w:r>
+      <w:r>
+        <w:rPr>
+          <w:rFonts w:ascii="Times New Roman" w:hAnsi="Times New Roman" w:cs="Times New Roman"/>
+          <w:b/>
+          <w:bCs/>
+        </w:rPr>
         <w:t>The Strategic Analytics Objective</w:t>
       </w:r>
     </w:p>
@@ -357,13 +381,30 @@
           <w:rFonts w:ascii="Times New Roman" w:hAnsi="Times New Roman" w:cs="Times New Roman"/>
           <w:b/>
           <w:bCs/>
-        </w:rPr>
-      </w:pPr>
-      <w:r>
-        <w:rPr>
-          <w:rFonts w:ascii="Times New Roman" w:hAnsi="Times New Roman" w:cs="Times New Roman"/>
-          <w:b/>
-          <w:bCs/>
+          <w:sz w:val="32"/>
+          <w:szCs w:val="32"/>
+          <w:u w:val="single"/>
+        </w:rPr>
+      </w:pPr>
+      <w:r>
+        <w:rPr>
+          <w:rFonts w:ascii="Times New Roman" w:hAnsi="Times New Roman" w:cs="Times New Roman"/>
+          <w:b/>
+          <w:bCs/>
+          <w:sz w:val="32"/>
+          <w:szCs w:val="32"/>
+          <w:u w:val="single"/>
+        </w:rPr>
+        <w:t xml:space="preserve">3. </w:t>
+      </w:r>
+      <w:r>
+        <w:rPr>
+          <w:rFonts w:ascii="Times New Roman" w:hAnsi="Times New Roman" w:cs="Times New Roman"/>
+          <w:b/>
+          <w:bCs/>
+          <w:sz w:val="32"/>
+          <w:szCs w:val="32"/>
+          <w:u w:val="single"/>
         </w:rPr>
         <w:t>Literature Review</w:t>
       </w:r>
@@ -469,11 +510,156 @@
     </w:p>
     <w:p>
       <w:pPr>
-        <w:jc w:val="center"/>
-        <w:rPr>
-          <w:rFonts w:ascii="Times New Roman" w:hAnsi="Times New Roman" w:cs="Times New Roman"/>
-        </w:rPr>
-      </w:pPr>
+        <w:rPr>
+          <w:rFonts w:ascii="Times New Roman" w:hAnsi="Times New Roman" w:cs="Times New Roman"/>
+        </w:rPr>
+      </w:pPr>
+      <w:r>
+        <w:rPr>
+          <w:rFonts w:ascii="Times New Roman" w:hAnsi="Times New Roman" w:cs="Times New Roman"/>
+        </w:rPr>
+        <w:t xml:space="preserve">If the predictive engine generates a false positive (identifying the patient as high-risk), the consequence is a low risk, non-invasive pelvic ultrasound or clinical consultation. However, a false negative (failing to catch a deteriorating patient) allows the disease to progress into deep infiltrating endometriosis, risking organ adhesions and compounding system-wide emergency </w:t>
+      </w:r>
+      <w:r>
+        <w:rPr>
+          <w:rFonts w:ascii="Times New Roman" w:hAnsi="Times New Roman" w:cs="Times New Roman"/>
+        </w:rPr>
+        <w:lastRenderedPageBreak/>
+        <w:t>care costs. This project will build upon existing clinical prediction literature to tune ensemble classifiers explicitly for high recall, turning raw clinical history into an administrative risk safeguard.</w:t>
+      </w:r>
+    </w:p>
+    <w:p>
+      <w:pPr>
+        <w:rPr>
+          <w:rFonts w:ascii="Times New Roman" w:hAnsi="Times New Roman" w:cs="Times New Roman"/>
+          <w:b/>
+          <w:bCs/>
+          <w:sz w:val="32"/>
+          <w:szCs w:val="32"/>
+          <w:u w:val="single"/>
+        </w:rPr>
+      </w:pPr>
+      <w:r>
+        <w:rPr>
+          <w:rFonts w:ascii="Times New Roman" w:hAnsi="Times New Roman" w:cs="Times New Roman"/>
+          <w:b/>
+          <w:bCs/>
+          <w:sz w:val="32"/>
+          <w:szCs w:val="32"/>
+          <w:u w:val="single"/>
+        </w:rPr>
+        <w:t xml:space="preserve">4. </w:t>
+      </w:r>
+      <w:r>
+        <w:rPr>
+          <w:rFonts w:ascii="Times New Roman" w:hAnsi="Times New Roman" w:cs="Times New Roman"/>
+          <w:b/>
+          <w:bCs/>
+          <w:sz w:val="32"/>
+          <w:szCs w:val="32"/>
+          <w:u w:val="single"/>
+        </w:rPr>
+        <w:t>Understanding The Data and Schema</w:t>
+      </w:r>
+    </w:p>
+    <w:p>
+      <w:pPr>
+        <w:rPr>
+          <w:rFonts w:ascii="Times New Roman" w:hAnsi="Times New Roman" w:cs="Times New Roman"/>
+          <w:b/>
+          <w:bCs/>
+        </w:rPr>
+      </w:pPr>
+      <w:r>
+        <w:rPr>
+          <w:rFonts w:ascii="Times New Roman" w:hAnsi="Times New Roman" w:cs="Times New Roman"/>
+          <w:b/>
+          <w:bCs/>
+        </w:rPr>
+        <w:t>4.1 Target Data Ingestion Strategy</w:t>
+      </w:r>
+    </w:p>
+    <w:p>
+      <w:pPr>
+        <w:rPr>
+          <w:rFonts w:ascii="Times New Roman" w:hAnsi="Times New Roman" w:cs="Times New Roman"/>
+        </w:rPr>
+      </w:pPr>
+      <w:r>
+        <w:rPr>
+          <w:rFonts w:ascii="Times New Roman" w:hAnsi="Times New Roman" w:cs="Times New Roman"/>
+        </w:rPr>
+        <w:t>To maintain complete data authenticity and ensure zero duplication with public coding repositories, this project targets raw, anonymized clinical data registries or patient-reported cohorts sourced from validated institutional or government health repositories tracking gynaecological health. The primary target framework will filter for the individual patient-reported clinical histories, structured features, and verified ground-truth clinical targets:</w:t>
+      </w:r>
+    </w:p>
+    <w:p>
+      <w:pPr>
+        <w:rPr>
+          <w:rFonts w:ascii="Times New Roman" w:hAnsi="Times New Roman" w:cs="Times New Roman"/>
+        </w:rPr>
+      </w:pPr>
+    </w:p>
+    <w:p>
+      <w:pPr>
+        <w:rPr>
+          <w:rFonts w:ascii="Times New Roman" w:hAnsi="Times New Roman" w:cs="Times New Roman"/>
+        </w:rPr>
+      </w:pPr>
+      <w:r>
+        <w:rPr>
+          <w:rFonts w:ascii="Times New Roman" w:hAnsi="Times New Roman" w:cs="Times New Roman"/>
+        </w:rPr>
+        <w:t>The underlying features selected for programmatic extraction include reproductive age baselines, numerical pain severity rankings, binary menstrual cycle patterns, and a categorical target variable tracking official clinical diagnosis codes matching the ICD-10 N80 (Endometriosis) classification matrix.</w:t>
+      </w:r>
+    </w:p>
+    <w:p>
+      <w:pPr>
+        <w:rPr>
+          <w:rFonts w:ascii="Times New Roman" w:hAnsi="Times New Roman" w:cs="Times New Roman"/>
+          <w:b/>
+          <w:bCs/>
+        </w:rPr>
+      </w:pPr>
+      <w:r>
+        <w:rPr>
+          <w:rFonts w:ascii="Times New Roman" w:hAnsi="Times New Roman" w:cs="Times New Roman"/>
+          <w:b/>
+          <w:bCs/>
+        </w:rPr>
+        <w:t>4.2 Data Risks and Contingency Mitigations</w:t>
+      </w:r>
+    </w:p>
+    <w:p>
+      <w:pPr>
+        <w:rPr>
+          <w:rFonts w:ascii="Times New Roman" w:hAnsi="Times New Roman" w:cs="Times New Roman"/>
+        </w:rPr>
+      </w:pPr>
+      <w:r>
+        <w:rPr>
+          <w:rFonts w:ascii="Times New Roman" w:hAnsi="Times New Roman" w:cs="Times New Roman"/>
+        </w:rPr>
+        <w:t>A known risk in specialized epidem</w:t>
+      </w:r>
+      <w:r>
+        <w:rPr>
+          <w:rFonts w:ascii="Times New Roman" w:hAnsi="Times New Roman" w:cs="Times New Roman"/>
+        </w:rPr>
+        <w:t xml:space="preserve">iological research is that raw government-sourced files can undergo licensing changes, face access approval delays, or suffer from extreme sparsity that prevents model convergence. To mitigate this operational risk, this project adopts a strict contingency architecture. </w:t>
+      </w:r>
+    </w:p>
+    <w:p>
+      <w:pPr>
+        <w:rPr>
+          <w:rFonts w:ascii="Times New Roman" w:hAnsi="Times New Roman" w:cs="Times New Roman"/>
+        </w:rPr>
+      </w:pPr>
+      <w:r>
+        <w:rPr>
+          <w:rFonts w:ascii="Times New Roman" w:hAnsi="Times New Roman" w:cs="Times New Roman"/>
+        </w:rPr>
+        <w:t>If data extraction from the primary government repository fails to meet baseline volume thresholds within the first three weeks, the project will transition to alternative validated, open-access clinical data cores or accredited public health survey platforms tracking reproductive health such as the European Commission CORDIS platform for data assets. The framework is engineered around generic features (Age, Pain Scales, Binary Signs), the identical Python cleaning and modelling source code will function seamlessly on the fallback dataset without altering the project’s strategic business goals or its core focus on reducing endometriosis diagnostic delays.</w:t>
+      </w:r>
     </w:p>
     <w:sectPr>
       <w:pgSz w:w="11906" w:h="16838"/>

</xml_diff>